<commit_message>
Update cold call pitch and add email/text outreach templates
- Rewrite service descriptions in cold call pitch to plain language a tradesperson
  can picture — no features lists, concrete examples of what actually happens
- Add voicemail-to-lead angle to the hook, solution, and pain points sections
- Fix $99/month pricing typo -> $79/month in objection handling
- Add missed call / voicemail as a fifth pain point
- Move cold call doc output to docs/ folder
- Add Cold Outreach — Email & Text Templates doc: cold email (two versions),
  two follow-ups, text templates, voicemail drop scripts, and 10-day sequence

Co-Authored-By: Claude Sonnet 4.6 <noreply@anthropic.com>
</commit_message>
<xml_diff>
--- a/docs/Cold Call Sales Pitch — How-To Guide.docx
+++ b/docs/Cold Call Sales Pitch — How-To Guide.docx
@@ -601,7 +601,7 @@
                 <w:color w:val="FFFFFF"/>
                 <w:sz w:val="22"/>
               </w:rPr>
-              <w:t>What's Included</w:t>
+              <w:t>What It Does — In Plain Language</w:t>
             </w:r>
           </w:p>
         </w:tc>
@@ -648,7 +648,7 @@
                 <w:color w:val="1C1C1A"/>
                 <w:sz w:val="22"/>
               </w:rPr>
-              <w:t>Professional one-page website, lead intake form (built in), instant email + text alert for every lead, Google Sheets lead log, monthly lead summary report, quarterly Google Business Profile audit, speed-to-lead facts sheet, form updates always included, ongoing site edits, custom domain connected</w:t>
+              <w:t>Builds a professional mobile-ready website and wires it up so that every time someone submits the contact form OR calls and misses you, the owner gets a text on their phone within minutes — name, number, and what they need. Every lead is automatically saved to a Google Sheet. Daily digest email every morning. Monthly report on the 1st. Quarterly Google Business Profile review. Ongoing site edits always included.</w:t>
             </w:r>
           </w:p>
         </w:tc>
@@ -695,7 +695,7 @@
                 <w:color w:val="1C1C1A"/>
                 <w:sz w:val="22"/>
               </w:rPr>
-              <w:t>Lead intake form added to their existing website, instant email + text alert for every lead, Google Sheets lead log, monthly lead summary report, quarterly Google Business Profile audit, speed-to-lead facts sheet, form updates always included — no new website needed</w:t>
+              <w:t>No new website needed. Adds a lead capture form to their existing site and wires up the same alert system — every form submission and every missed call sends a text to the owner's phone within minutes. Everything logged automatically in Google Sheets. Same daily digest, monthly report, and GBP audit as the full package.</w:t>
             </w:r>
           </w:p>
         </w:tc>
@@ -1207,7 +1207,52 @@
                 <w:color w:val="1C1C1A"/>
                 <w:sz w:val="22"/>
               </w:rPr>
-              <w:t>A customer fills out a form or calls. They miss it. By the time they call back, the customer booked someone else.</w:t>
+              <w:t>A customer fills out a form or calls while the owner is under a sink. They miss it. By the time they call back — hours later — the customer already booked someone else.</w:t>
+            </w:r>
+          </w:p>
+        </w:tc>
+      </w:tr>
+      <w:tr>
+        <w:tc>
+          <w:tcPr>
+            <w:tcW w:type="dxa" w:w="2520"/>
+            <w:tcMar>
+              <w:top w:w="80" w:type="dxa"/>
+              <w:bottom w:w="80" w:type="dxa"/>
+              <w:left w:w="115" w:type="dxa"/>
+              <w:right w:w="115" w:type="dxa"/>
+            </w:tcMar>
+          </w:tcPr>
+          <w:p>
+            <w:r>
+              <w:rPr>
+                <w:rFonts w:ascii="Arial" w:hAnsi="Arial"/>
+                <w:b/>
+                <w:color w:val="1A3A2A"/>
+                <w:sz w:val="22"/>
+              </w:rPr>
+              <w:t>Missed calls with no follow-up system</w:t>
+            </w:r>
+          </w:p>
+        </w:tc>
+        <w:tc>
+          <w:tcPr>
+            <w:tcW w:type="dxa" w:w="6480"/>
+            <w:tcMar>
+              <w:top w:w="80" w:type="dxa"/>
+              <w:bottom w:w="80" w:type="dxa"/>
+              <w:left w:w="115" w:type="dxa"/>
+              <w:right w:w="115" w:type="dxa"/>
+            </w:tcMar>
+          </w:tcPr>
+          <w:p>
+            <w:r>
+              <w:rPr>
+                <w:rFonts w:ascii="Arial" w:hAnsi="Arial"/>
+                <w:color w:val="1C1C1A"/>
+                <w:sz w:val="22"/>
+              </w:rPr>
+              <w:t>They get a voicemail. They listen to it at 6pm, forget by morning, and never call back. That was a $600 job. Gone.</w:t>
             </w:r>
           </w:p>
         </w:tc>
@@ -1385,6 +1430,29 @@
           <w:color w:val="1C1C1A"/>
           <w:sz w:val="22"/>
         </w:rPr>
+        <w:t xml:space="preserve">Voicemail-to-lead: </w:t>
+      </w:r>
+      <w:r>
+        <w:rPr>
+          <w:rFonts w:ascii="Arial" w:hAnsi="Arial"/>
+          <w:color w:val="1C1C1A"/>
+          <w:sz w:val="22"/>
+        </w:rPr>
+        <w:t>Covers both form submissions AND missed calls — both log as leads and both send a text alert to the owner.</w:t>
+      </w:r>
+    </w:p>
+    <w:p>
+      <w:pPr>
+        <w:pStyle w:val="ListBullet"/>
+        <w:spacing w:before="0" w:after="80"/>
+      </w:pPr>
+      <w:r>
+        <w:rPr>
+          <w:rFonts w:ascii="Arial" w:hAnsi="Arial"/>
+          <w:b/>
+          <w:color w:val="1C1C1A"/>
+          <w:sz w:val="22"/>
+        </w:rPr>
         <w:t xml:space="preserve">Ownership: </w:t>
       </w:r>
       <w:r>
@@ -1462,7 +1530,7 @@
           <w:color w:val="1C1C1A"/>
           <w:sz w:val="22"/>
         </w:rPr>
-        <w:t>Affordable — $79/month for the full website + lead management package. $59/month if they already have a site.</w:t>
+        <w:t>$79/month for the full website + lead management package. $59/month if they already have a site.</w:t>
       </w:r>
     </w:p>
     <w:p>
@@ -2068,7 +2136,7 @@
           <w:color w:val="1C1C1A"/>
           <w:sz w:val="18"/>
         </w:rPr>
-        <w:t>"Here's the thing — most [plumbers] I talk to are losing 3 or 4 jobs a month and they don't even know it. A customer Googles them, finds nothing — or finds a website that looks like it's from 2009 — and calls the next guy. Or they fill out a form while you're on a job and by the time you call back, they've already booked someone else. That's real money walking out the door every single month."</w:t>
+        <w:t>"Here's the thing — most [plumbers] I talk to are losing 3 or 4 jobs a month and they don't even know it. A customer Googles them, finds nothing — or finds a site that looks like it's from 2009 — and calls the next guy. Or they fill out a form while you're on a job and by the time you call back, they've already booked someone else. Or they leave a voicemail, and you hear it at 7pm, forget about it by morning, and that was a $600 job gone. That's real money walking out the door every single month."</w:t>
       </w:r>
     </w:p>
     <w:p>
@@ -2096,7 +2164,7 @@
           <w:color w:val="1C1C1A"/>
           <w:sz w:val="18"/>
         </w:rPr>
-        <w:t>"What I do is build you a professional website that looks great on a phone — because that's how people are searching — and I wire up a system so that every lead that comes in goes straight to your inbox within minutes, organized and ready to call back. You're not staring at a spreadsheet. You're just getting a text that says: 'New lead — Maria G., kitchen remodel, $12K budget, wants to start in 3 weeks. Call today.' You're live in under a week. And it's $79 a month after a one-time setup fee."</w:t>
+        <w:t>"What I do is build you a professional website that looks great on a phone — because that's how people are searching — and wire up a system so that every lead that comes in goes straight to your phone as a text within minutes. Form submission, missed call, voicemail — all of it. Your phone buzzes and it says: 'New lead — Mike R., leaking pipe under kitchen sink, Naperville. Call back today.' You're not checking a dashboard. You're not logging into anything. You just get a text. You're live in under a week. It's $79 a month after a one-time setup."</w:t>
       </w:r>
     </w:p>
     <w:p>
@@ -2283,7 +2351,7 @@
           <w:color w:val="1C1C1A"/>
           <w:sz w:val="18"/>
         </w:rPr>
-        <w:t>"I hear you — and that's exactly why I want to show you the math. If one saved lead a month is worth $600 to you, and my fee is $99 a month, you're net positive by $500 every single month. And if it doesn't work in 60 days, you get every monthly payment back. You're not risking the money — you're risking 60 days of your time."</w:t>
+        <w:t>"I hear you — and that's exactly why I want to show you the math. If one saved lead a month is worth $600 to you, and my fee is $79 a month, you're net positive by over $500 every single month. And if it doesn't work in 60 days, you get every monthly payment back. You're not risking the money — you're risking 60 days of your time."</w:t>
       </w:r>
     </w:p>
     <w:p>

</xml_diff>